<commit_message>
test(qa): finalize Member 3 QA implementation and evidence
</commit_message>
<xml_diff>
--- a/QA/member 3.docx
+++ b/QA/member 3.docx
@@ -6,8 +6,18 @@
       <w:r>
         <w:t xml:space="preserve">We have selected </w:t>
       </w:r>
-      <w:r>
-        <w:t>createRequest()</w:t>
+      <w:proofErr w:type="spellStart"/>
+      <w:proofErr w:type="gramStart"/>
+      <w:r>
+        <w:t>createRequest</w:t>
+      </w:r>
+      <w:proofErr w:type="spellEnd"/>
+      <w:r>
+        <w:t>(</w:t>
+      </w:r>
+      <w:proofErr w:type="gramEnd"/>
+      <w:r>
+        <w:t>)</w:t>
       </w:r>
       <w:r>
         <w:t xml:space="preserve"> in the </w:t>
@@ -17,7 +27,15 @@
       </w:r>
       <w:r>
         <w:br/>
-        <w:t>as the whitebox test target</w:t>
+        <w:t xml:space="preserve">as the </w:t>
+      </w:r>
+      <w:proofErr w:type="spellStart"/>
+      <w:r>
+        <w:t>whitebox</w:t>
+      </w:r>
+      <w:proofErr w:type="spellEnd"/>
+      <w:r>
+        <w:t xml:space="preserve"> test target</w:t>
       </w:r>
       <w:r>
         <w:br/>
@@ -156,8 +174,18 @@
       <w:r>
         <w:t xml:space="preserve">For </w:t>
       </w:r>
-      <w:r>
-        <w:t>createRequest()</w:t>
+      <w:proofErr w:type="spellStart"/>
+      <w:proofErr w:type="gramStart"/>
+      <w:r>
+        <w:t>createRequest</w:t>
+      </w:r>
+      <w:proofErr w:type="spellEnd"/>
+      <w:r>
+        <w:t>(</w:t>
+      </w:r>
+      <w:proofErr w:type="gramEnd"/>
+      <w:r>
+        <w:t>)</w:t>
       </w:r>
     </w:p>
     <w:p/>
@@ -272,11 +300,6 @@
       </w:r>
     </w:p>
     <w:p>
-      <w:pPr>
-        <w:rPr>
-          <w:noProof/>
-        </w:rPr>
-      </w:pPr>
       <w:r>
         <w:rPr>
           <w:noProof/>
@@ -319,35 +342,31 @@
         </w:drawing>
       </w:r>
     </w:p>
+    <w:p/>
     <w:p>
       <w:r>
         <w:br w:type="page"/>
       </w:r>
+    </w:p>
+    <w:p>
+      <w:proofErr w:type="spellStart"/>
+      <w:r>
+        <w:lastRenderedPageBreak/>
+        <w:t>SonarCube</w:t>
+      </w:r>
+      <w:proofErr w:type="spellEnd"/>
+      <w:r>
+        <w:br/>
+      </w:r>
       <w:r>
         <w:rPr>
-          <w:b/>
-          <w:bCs/>
-          <w:sz w:val="40"/>
-          <w:szCs w:val="40"/>
+          <w:noProof/>
         </w:rPr>
-        <w:lastRenderedPageBreak/>
-        <w:t>CI</w:t>
-      </w:r>
-      <w:r>
-        <w:t xml:space="preserve"> </w:t>
-      </w:r>
-      <w:r>
-        <w:br/>
-      </w:r>
-      <w:r>
-        <w:br/>
-      </w:r>
-      <w:r>
         <w:drawing>
-          <wp:inline distT="0" distB="0" distL="0" distR="0" wp14:anchorId="042DE403" wp14:editId="28421ACE">
-            <wp:extent cx="5943600" cy="2827655"/>
+          <wp:inline distT="0" distB="0" distL="0" distR="0" wp14:anchorId="1860BBEE" wp14:editId="6335F46C">
+            <wp:extent cx="5943600" cy="3185795"/>
             <wp:effectExtent l="0" t="0" r="0" b="0"/>
-            <wp:docPr id="1189954682" name="Picture 1"/>
+            <wp:docPr id="476819326" name="Picture 1"/>
             <wp:cNvGraphicFramePr>
               <a:graphicFrameLocks xmlns:a="http://schemas.openxmlformats.org/drawingml/2006/main" noChangeAspect="1"/>
             </wp:cNvGraphicFramePr>
@@ -355,7 +374,7 @@
               <a:graphicData uri="http://schemas.openxmlformats.org/drawingml/2006/picture">
                 <pic:pic xmlns:pic="http://schemas.openxmlformats.org/drawingml/2006/picture">
                   <pic:nvPicPr>
-                    <pic:cNvPr id="1189954682" name=""/>
+                    <pic:cNvPr id="476819326" name=""/>
                     <pic:cNvPicPr/>
                   </pic:nvPicPr>
                   <pic:blipFill>
@@ -367,7 +386,7 @@
                   <pic:spPr>
                     <a:xfrm>
                       <a:off x="0" y="0"/>
-                      <a:ext cx="5943600" cy="2827655"/>
+                      <a:ext cx="5943600" cy="3185795"/>
                     </a:xfrm>
                     <a:prstGeom prst="rect">
                       <a:avLst/>
@@ -379,14 +398,15 @@
           </wp:inline>
         </w:drawing>
       </w:r>
-    </w:p>
-    <w:p>
-      <w:r>
+      <w:r>
+        <w:rPr>
+          <w:noProof/>
+        </w:rPr>
         <w:drawing>
-          <wp:inline distT="0" distB="0" distL="0" distR="0" wp14:anchorId="07DE5935" wp14:editId="0C00E33A">
-            <wp:extent cx="5943600" cy="4176395"/>
+          <wp:inline distT="0" distB="0" distL="0" distR="0" wp14:anchorId="742A89B4" wp14:editId="6DC08B52">
+            <wp:extent cx="5943600" cy="3164205"/>
             <wp:effectExtent l="0" t="0" r="0" b="0"/>
-            <wp:docPr id="1241601834" name="Picture 1"/>
+            <wp:docPr id="1615677736" name="Picture 1"/>
             <wp:cNvGraphicFramePr>
               <a:graphicFrameLocks xmlns:a="http://schemas.openxmlformats.org/drawingml/2006/main" noChangeAspect="1"/>
             </wp:cNvGraphicFramePr>
@@ -394,7 +414,7 @@
               <a:graphicData uri="http://schemas.openxmlformats.org/drawingml/2006/picture">
                 <pic:pic xmlns:pic="http://schemas.openxmlformats.org/drawingml/2006/picture">
                   <pic:nvPicPr>
-                    <pic:cNvPr id="1241601834" name=""/>
+                    <pic:cNvPr id="1615677736" name=""/>
                     <pic:cNvPicPr/>
                   </pic:nvPicPr>
                   <pic:blipFill>
@@ -406,7 +426,7 @@
                   <pic:spPr>
                     <a:xfrm>
                       <a:off x="0" y="0"/>
-                      <a:ext cx="5943600" cy="4176395"/>
+                      <a:ext cx="5943600" cy="3164205"/>
                     </a:xfrm>
                     <a:prstGeom prst="rect">
                       <a:avLst/>
@@ -418,7 +438,355 @@
           </wp:inline>
         </w:drawing>
       </w:r>
+      <w:r>
+        <w:rPr>
+          <w:noProof/>
+        </w:rPr>
+        <w:lastRenderedPageBreak/>
+        <w:drawing>
+          <wp:inline distT="0" distB="0" distL="0" distR="0" wp14:anchorId="0A444A10" wp14:editId="4C612C8E">
+            <wp:extent cx="5943600" cy="3311525"/>
+            <wp:effectExtent l="0" t="0" r="0" b="3175"/>
+            <wp:docPr id="1048167321" name="Picture 1"/>
+            <wp:cNvGraphicFramePr>
+              <a:graphicFrameLocks xmlns:a="http://schemas.openxmlformats.org/drawingml/2006/main" noChangeAspect="1"/>
+            </wp:cNvGraphicFramePr>
+            <a:graphic xmlns:a="http://schemas.openxmlformats.org/drawingml/2006/main">
+              <a:graphicData uri="http://schemas.openxmlformats.org/drawingml/2006/picture">
+                <pic:pic xmlns:pic="http://schemas.openxmlformats.org/drawingml/2006/picture">
+                  <pic:nvPicPr>
+                    <pic:cNvPr id="1048167321" name=""/>
+                    <pic:cNvPicPr/>
+                  </pic:nvPicPr>
+                  <pic:blipFill>
+                    <a:blip r:embed="rId13"/>
+                    <a:stretch>
+                      <a:fillRect/>
+                    </a:stretch>
+                  </pic:blipFill>
+                  <pic:spPr>
+                    <a:xfrm>
+                      <a:off x="0" y="0"/>
+                      <a:ext cx="5943600" cy="3311525"/>
+                    </a:xfrm>
+                    <a:prstGeom prst="rect">
+                      <a:avLst/>
+                    </a:prstGeom>
+                  </pic:spPr>
+                </pic:pic>
+              </a:graphicData>
+            </a:graphic>
+          </wp:inline>
+        </w:drawing>
+      </w:r>
+      <w:r>
+        <w:rPr>
+          <w:noProof/>
+        </w:rPr>
+        <w:drawing>
+          <wp:inline distT="0" distB="0" distL="0" distR="0" wp14:anchorId="41F3D7EE" wp14:editId="2B232F2E">
+            <wp:extent cx="5943600" cy="2727325"/>
+            <wp:effectExtent l="0" t="0" r="0" b="0"/>
+            <wp:docPr id="563641065" name="Picture 1"/>
+            <wp:cNvGraphicFramePr>
+              <a:graphicFrameLocks xmlns:a="http://schemas.openxmlformats.org/drawingml/2006/main" noChangeAspect="1"/>
+            </wp:cNvGraphicFramePr>
+            <a:graphic xmlns:a="http://schemas.openxmlformats.org/drawingml/2006/main">
+              <a:graphicData uri="http://schemas.openxmlformats.org/drawingml/2006/picture">
+                <pic:pic xmlns:pic="http://schemas.openxmlformats.org/drawingml/2006/picture">
+                  <pic:nvPicPr>
+                    <pic:cNvPr id="563641065" name=""/>
+                    <pic:cNvPicPr/>
+                  </pic:nvPicPr>
+                  <pic:blipFill>
+                    <a:blip r:embed="rId14"/>
+                    <a:stretch>
+                      <a:fillRect/>
+                    </a:stretch>
+                  </pic:blipFill>
+                  <pic:spPr>
+                    <a:xfrm>
+                      <a:off x="0" y="0"/>
+                      <a:ext cx="5943600" cy="2727325"/>
+                    </a:xfrm>
+                    <a:prstGeom prst="rect">
+                      <a:avLst/>
+                    </a:prstGeom>
+                  </pic:spPr>
+                </pic:pic>
+              </a:graphicData>
+            </a:graphic>
+          </wp:inline>
+        </w:drawing>
+      </w:r>
+      <w:r>
+        <w:rPr>
+          <w:noProof/>
+        </w:rPr>
+        <w:lastRenderedPageBreak/>
+        <w:drawing>
+          <wp:inline distT="0" distB="0" distL="0" distR="0" wp14:anchorId="439DDC79" wp14:editId="57D61A62">
+            <wp:extent cx="5943600" cy="3184525"/>
+            <wp:effectExtent l="0" t="0" r="0" b="0"/>
+            <wp:docPr id="370534198" name="Picture 1"/>
+            <wp:cNvGraphicFramePr>
+              <a:graphicFrameLocks xmlns:a="http://schemas.openxmlformats.org/drawingml/2006/main" noChangeAspect="1"/>
+            </wp:cNvGraphicFramePr>
+            <a:graphic xmlns:a="http://schemas.openxmlformats.org/drawingml/2006/main">
+              <a:graphicData uri="http://schemas.openxmlformats.org/drawingml/2006/picture">
+                <pic:pic xmlns:pic="http://schemas.openxmlformats.org/drawingml/2006/picture">
+                  <pic:nvPicPr>
+                    <pic:cNvPr id="370534198" name=""/>
+                    <pic:cNvPicPr/>
+                  </pic:nvPicPr>
+                  <pic:blipFill>
+                    <a:blip r:embed="rId15"/>
+                    <a:stretch>
+                      <a:fillRect/>
+                    </a:stretch>
+                  </pic:blipFill>
+                  <pic:spPr>
+                    <a:xfrm>
+                      <a:off x="0" y="0"/>
+                      <a:ext cx="5943600" cy="3184525"/>
+                    </a:xfrm>
+                    <a:prstGeom prst="rect">
+                      <a:avLst/>
+                    </a:prstGeom>
+                  </pic:spPr>
+                </pic:pic>
+              </a:graphicData>
+            </a:graphic>
+          </wp:inline>
+        </w:drawing>
+      </w:r>
+      <w:r>
+        <w:rPr>
+          <w:noProof/>
+        </w:rPr>
+        <w:drawing>
+          <wp:inline distT="0" distB="0" distL="0" distR="0" wp14:anchorId="5BC4ABDB" wp14:editId="39A6B41E">
+            <wp:extent cx="5943600" cy="3184525"/>
+            <wp:effectExtent l="0" t="0" r="0" b="0"/>
+            <wp:docPr id="130779737" name="Picture 1"/>
+            <wp:cNvGraphicFramePr>
+              <a:graphicFrameLocks xmlns:a="http://schemas.openxmlformats.org/drawingml/2006/main" noChangeAspect="1"/>
+            </wp:cNvGraphicFramePr>
+            <a:graphic xmlns:a="http://schemas.openxmlformats.org/drawingml/2006/main">
+              <a:graphicData uri="http://schemas.openxmlformats.org/drawingml/2006/picture">
+                <pic:pic xmlns:pic="http://schemas.openxmlformats.org/drawingml/2006/picture">
+                  <pic:nvPicPr>
+                    <pic:cNvPr id="130779737" name=""/>
+                    <pic:cNvPicPr/>
+                  </pic:nvPicPr>
+                  <pic:blipFill>
+                    <a:blip r:embed="rId16"/>
+                    <a:stretch>
+                      <a:fillRect/>
+                    </a:stretch>
+                  </pic:blipFill>
+                  <pic:spPr>
+                    <a:xfrm>
+                      <a:off x="0" y="0"/>
+                      <a:ext cx="5943600" cy="3184525"/>
+                    </a:xfrm>
+                    <a:prstGeom prst="rect">
+                      <a:avLst/>
+                    </a:prstGeom>
+                  </pic:spPr>
+                </pic:pic>
+              </a:graphicData>
+            </a:graphic>
+          </wp:inline>
+        </w:drawing>
+      </w:r>
+      <w:r>
+        <w:rPr>
+          <w:noProof/>
+        </w:rPr>
+        <w:lastRenderedPageBreak/>
+        <w:drawing>
+          <wp:inline distT="0" distB="0" distL="0" distR="0" wp14:anchorId="49BAA345" wp14:editId="5737A37D">
+            <wp:extent cx="5943600" cy="3199765"/>
+            <wp:effectExtent l="0" t="0" r="0" b="635"/>
+            <wp:docPr id="2090486074" name="Picture 1"/>
+            <wp:cNvGraphicFramePr>
+              <a:graphicFrameLocks xmlns:a="http://schemas.openxmlformats.org/drawingml/2006/main" noChangeAspect="1"/>
+            </wp:cNvGraphicFramePr>
+            <a:graphic xmlns:a="http://schemas.openxmlformats.org/drawingml/2006/main">
+              <a:graphicData uri="http://schemas.openxmlformats.org/drawingml/2006/picture">
+                <pic:pic xmlns:pic="http://schemas.openxmlformats.org/drawingml/2006/picture">
+                  <pic:nvPicPr>
+                    <pic:cNvPr id="2090486074" name=""/>
+                    <pic:cNvPicPr/>
+                  </pic:nvPicPr>
+                  <pic:blipFill>
+                    <a:blip r:embed="rId17"/>
+                    <a:stretch>
+                      <a:fillRect/>
+                    </a:stretch>
+                  </pic:blipFill>
+                  <pic:spPr>
+                    <a:xfrm>
+                      <a:off x="0" y="0"/>
+                      <a:ext cx="5943600" cy="3199765"/>
+                    </a:xfrm>
+                    <a:prstGeom prst="rect">
+                      <a:avLst/>
+                    </a:prstGeom>
+                  </pic:spPr>
+                </pic:pic>
+              </a:graphicData>
+            </a:graphic>
+          </wp:inline>
+        </w:drawing>
+      </w:r>
     </w:p>
+    <w:p/>
+    <w:p/>
+    <w:p/>
+    <w:p/>
+    <w:p/>
+    <w:p>
+      <w:r>
+        <w:br w:type="page"/>
+      </w:r>
+    </w:p>
+    <w:p/>
+    <w:p>
+      <w:r>
+        <w:t>Concurrency tests</w:t>
+      </w:r>
+      <w:r>
+        <w:drawing>
+          <wp:inline distT="0" distB="0" distL="0" distR="0" wp14:anchorId="7C83A185" wp14:editId="6BA6DEBC">
+            <wp:extent cx="4741606" cy="2405757"/>
+            <wp:effectExtent l="0" t="0" r="1905" b="0"/>
+            <wp:docPr id="681264270" name="Picture 1"/>
+            <wp:cNvGraphicFramePr>
+              <a:graphicFrameLocks xmlns:a="http://schemas.openxmlformats.org/drawingml/2006/main" noChangeAspect="1"/>
+            </wp:cNvGraphicFramePr>
+            <a:graphic xmlns:a="http://schemas.openxmlformats.org/drawingml/2006/main">
+              <a:graphicData uri="http://schemas.openxmlformats.org/drawingml/2006/picture">
+                <pic:pic xmlns:pic="http://schemas.openxmlformats.org/drawingml/2006/picture">
+                  <pic:nvPicPr>
+                    <pic:cNvPr id="681264270" name=""/>
+                    <pic:cNvPicPr/>
+                  </pic:nvPicPr>
+                  <pic:blipFill>
+                    <a:blip r:embed="rId18"/>
+                    <a:stretch>
+                      <a:fillRect/>
+                    </a:stretch>
+                  </pic:blipFill>
+                  <pic:spPr>
+                    <a:xfrm>
+                      <a:off x="0" y="0"/>
+                      <a:ext cx="4749560" cy="2409793"/>
+                    </a:xfrm>
+                    <a:prstGeom prst="rect">
+                      <a:avLst/>
+                    </a:prstGeom>
+                  </pic:spPr>
+                </pic:pic>
+              </a:graphicData>
+            </a:graphic>
+          </wp:inline>
+        </w:drawing>
+      </w:r>
+      <w:r>
+        <w:drawing>
+          <wp:inline distT="0" distB="0" distL="0" distR="0" wp14:anchorId="7CE79CDB" wp14:editId="66D65124">
+            <wp:extent cx="4741545" cy="2420416"/>
+            <wp:effectExtent l="0" t="0" r="1905" b="0"/>
+            <wp:docPr id="1449733553" name="Picture 1"/>
+            <wp:cNvGraphicFramePr>
+              <a:graphicFrameLocks xmlns:a="http://schemas.openxmlformats.org/drawingml/2006/main" noChangeAspect="1"/>
+            </wp:cNvGraphicFramePr>
+            <a:graphic xmlns:a="http://schemas.openxmlformats.org/drawingml/2006/main">
+              <a:graphicData uri="http://schemas.openxmlformats.org/drawingml/2006/picture">
+                <pic:pic xmlns:pic="http://schemas.openxmlformats.org/drawingml/2006/picture">
+                  <pic:nvPicPr>
+                    <pic:cNvPr id="1449733553" name=""/>
+                    <pic:cNvPicPr/>
+                  </pic:nvPicPr>
+                  <pic:blipFill>
+                    <a:blip r:embed="rId19"/>
+                    <a:stretch>
+                      <a:fillRect/>
+                    </a:stretch>
+                  </pic:blipFill>
+                  <pic:spPr>
+                    <a:xfrm>
+                      <a:off x="0" y="0"/>
+                      <a:ext cx="4753260" cy="2426396"/>
+                    </a:xfrm>
+                    <a:prstGeom prst="rect">
+                      <a:avLst/>
+                    </a:prstGeom>
+                  </pic:spPr>
+                </pic:pic>
+              </a:graphicData>
+            </a:graphic>
+          </wp:inline>
+        </w:drawing>
+      </w:r>
+      <w:r>
+        <w:br/>
+      </w:r>
+      <w:r>
+        <w:br/>
+        <w:t xml:space="preserve">Ran x2 times </w:t>
+      </w:r>
+      <w:r>
+        <w:br/>
+      </w:r>
+      <w:r>
+        <w:br/>
+      </w:r>
+      <w:r>
+        <w:drawing>
+          <wp:inline distT="0" distB="0" distL="0" distR="0" wp14:anchorId="1D1D2563" wp14:editId="6322FFD9">
+            <wp:extent cx="3967316" cy="2105307"/>
+            <wp:effectExtent l="0" t="0" r="0" b="9525"/>
+            <wp:docPr id="1082702115" name="Picture 1"/>
+            <wp:cNvGraphicFramePr>
+              <a:graphicFrameLocks xmlns:a="http://schemas.openxmlformats.org/drawingml/2006/main" noChangeAspect="1"/>
+            </wp:cNvGraphicFramePr>
+            <a:graphic xmlns:a="http://schemas.openxmlformats.org/drawingml/2006/main">
+              <a:graphicData uri="http://schemas.openxmlformats.org/drawingml/2006/picture">
+                <pic:pic xmlns:pic="http://schemas.openxmlformats.org/drawingml/2006/picture">
+                  <pic:nvPicPr>
+                    <pic:cNvPr id="1082702115" name=""/>
+                    <pic:cNvPicPr/>
+                  </pic:nvPicPr>
+                  <pic:blipFill>
+                    <a:blip r:embed="rId20"/>
+                    <a:stretch>
+                      <a:fillRect/>
+                    </a:stretch>
+                  </pic:blipFill>
+                  <pic:spPr>
+                    <a:xfrm>
+                      <a:off x="0" y="0"/>
+                      <a:ext cx="4098027" cy="2174670"/>
+                    </a:xfrm>
+                    <a:prstGeom prst="rect">
+                      <a:avLst/>
+                    </a:prstGeom>
+                  </pic:spPr>
+                </pic:pic>
+              </a:graphicData>
+            </a:graphic>
+          </wp:inline>
+        </w:drawing>
+      </w:r>
+      <w:r>
+        <w:br w:type="page"/>
+      </w:r>
+    </w:p>
+    <w:p/>
+    <w:p/>
     <w:sectPr>
       <w:pgSz w:w="12240" w:h="15840"/>
       <w:pgMar w:top="1440" w:right="1440" w:bottom="1440" w:left="1440" w:header="720" w:footer="720" w:gutter="0"/>

</xml_diff>